<commit_message>
fix: the curious of document | feat: add mission for jon
</commit_message>
<xml_diff>
--- a/curiosidades/lindinha.docx
+++ b/curiosidades/lindinha.docx
@@ -41,6 +41,9 @@
       <w:r>
         <w:t>, destacando o seu carisma e sensibilidade</w:t>
       </w:r>
+      <w:r>
+        <w:t>.</w:t>
+      </w:r>
     </w:p>
     <w:p>
       <w:pPr>
@@ -143,6 +146,23 @@
       </w:pPr>
       <w:r>
         <w:t xml:space="preserve">Lindinha </w:t>
+      </w:r>
+      <w:r>
+        <w:t xml:space="preserve">é popularmente conhecida, mundo afora, como </w:t>
+      </w:r>
+      <w:proofErr w:type="spellStart"/>
+      <w:r>
+        <w:t>bubbles</w:t>
+      </w:r>
+      <w:proofErr w:type="spellEnd"/>
+      <w:r>
+        <w:t xml:space="preserve"> (bolhas em inglês)</w:t>
+      </w:r>
+      <w:r>
+        <w:t xml:space="preserve">, mas no Brasil ela foi nomeada de </w:t>
+      </w:r>
+      <w:r>
+        <w:t>Lindinha a fim de reforçar o ponto de vista brasileiro sobre a personagem.</w:t>
       </w:r>
     </w:p>
     <w:sectPr>

</xml_diff>